<commit_message>
Condensation workflow parameter; intermediate Russian build
Co-Authored-By: Claude Opus 5.5 <noreply@anthropic.com>
Claude-Session: https://claude.ai/code/session_01WcXt6iEQKTpJkT13ui6H64
</commit_message>
<xml_diff>
--- a/dissertation/build/ru/Dissertation_ru.docx
+++ b/dissertation/build/ru/Dissertation_ru.docx
@@ -292,7 +292,7 @@
         <w:pStyle w:val="Annotation"/>
       </w:pPr>
       <w:r>
-        <w:t xml:space="preserve">For Al-filtered beams, the DM reproduces the SpekPy half-value layer within 5 % and the DEF within 2 %. The unfiltered spectrum is dominated by the Cu K lines at 8.0–8.9 keV (68.5 % of the photons), so the DEF for 1 % Ag by mass is only 1.20 and remains within 1.19–1.21 when the anode angle, tube voltage or beryllium window is changed. Added filtration is the decisive parameter: 1 mm Al raises the DEF to 1.48 ± 0.02 (k = 1), 2 mm Al to 1.62 and 0.2 mm Cu to 1.80, while the air kerma decreases 120–1300-fold. At equal transmission, light and medium-Z filters (Al, Ti) are optimal, whereas filters with K-edges at 20–30 keV (Mo, Ag, Sn) are the least effective at strong filtration. The DEF increases with depth (beam hardening) and decreases inside a heavily loaded region (self-shielding); Monte Carlo calculations confirm these values within 1–10 %. Per unit mass, Ag is a weaker physical sensitizer than Au, Pt, Bi or Gd and is comparable to iodine. The xraylib 4.3.0 energy-absorption data for light elements were found to be up to 37 % too low, which would overestimate the DEF. The results support the choice of filtration and exposure conditions for experiments with Ag-containing radiosensitizers.</w:t>
+        <w:t xml:space="preserve">For beams filtered with 1 mm Al, the DM reproduces the SpekPy half-value layer within 5 %, and with Al filters the DEF within 2 %. The unfiltered spectrum is dominated by the Cu K lines at 8.0–8.9 keV (68.5 % of the photons), so the DEF for 1 % Ag by mass is only 1.20 and remains within 1.19–1.21 when the anode angle, tube voltage or beryllium window is changed. Added filtration is the decisive parameter: 1 mm Al raises the DEF to 1.48 ± 0.02 (k = 1), 2 mm Al to 1.62 and 0.2 mm Cu to 1.80, while the air kerma decreases 120–1300-fold. At equal transmission, light and medium-Z filters (Al, Ti) are optimal, whereas filters with K-edges at 20–30 keV (Mo, Ag, Sn) are the least effective at strong filtration. The DEF increases with depth (beam hardening) and decreases inside a heavily loaded region (self-shielding); Monte Carlo calculations confirm these values within 1–10 %. Per unit mass, Ag is a weaker physical sensitizer than Au, Pt, Bi or Gd and is comparable to iodine. The xraylib 4.3.0 energy-absorption data for light elements were found to be up to 56 % too low, which would overestimate the DEF. The results support the choice of filtration and exposure conditions for experiments with Ag-containing radiosensitizers.</w:t>
       </w:r>
     </w:p>
     <w:p>
@@ -337,7 +337,6 @@
       </w:r>
       <w:r>
         <w:tab/>
-        <w:t>7</w:t>
       </w:r>
     </w:p>
     <w:p>
@@ -356,7 +355,6 @@
       </w:r>
       <w:r>
         <w:tab/>
-        <w:t>9</w:t>
       </w:r>
     </w:p>
     <w:p>
@@ -375,7 +373,6 @@
       </w:r>
       <w:r>
         <w:tab/>
-        <w:t>16</w:t>
       </w:r>
     </w:p>
     <w:p>
@@ -391,7 +388,6 @@
       </w:r>
       <w:r>
         <w:tab/>
-        <w:t>16</w:t>
       </w:r>
     </w:p>
     <w:p>
@@ -407,7 +403,6 @@
       </w:r>
       <w:r>
         <w:tab/>
-        <w:t>17</w:t>
       </w:r>
     </w:p>
     <w:p>
@@ -423,7 +418,6 @@
       </w:r>
       <w:r>
         <w:tab/>
-        <w:t>21</w:t>
       </w:r>
     </w:p>
     <w:p>
@@ -439,7 +433,6 @@
       </w:r>
       <w:r>
         <w:tab/>
-        <w:t>25</w:t>
       </w:r>
     </w:p>
     <w:p>
@@ -455,7 +448,6 @@
       </w:r>
       <w:r>
         <w:tab/>
-        <w:t>28</w:t>
       </w:r>
     </w:p>
     <w:p>
@@ -471,7 +463,6 @@
       </w:r>
       <w:r>
         <w:tab/>
-        <w:t>31</w:t>
       </w:r>
     </w:p>
     <w:p>
@@ -490,7 +481,6 @@
       </w:r>
       <w:r>
         <w:tab/>
-        <w:t>33</w:t>
       </w:r>
     </w:p>
     <w:p>
@@ -506,7 +496,6 @@
       </w:r>
       <w:r>
         <w:tab/>
-        <w:t>33</w:t>
       </w:r>
     </w:p>
     <w:p>
@@ -522,7 +511,6 @@
       </w:r>
       <w:r>
         <w:tab/>
-        <w:t>35</w:t>
       </w:r>
     </w:p>
     <w:p>
@@ -538,7 +526,6 @@
       </w:r>
       <w:r>
         <w:tab/>
-        <w:t>37</w:t>
       </w:r>
     </w:p>
     <w:p>
@@ -554,7 +541,6 @@
       </w:r>
       <w:r>
         <w:tab/>
-        <w:t>39</w:t>
       </w:r>
     </w:p>
     <w:p>
@@ -570,7 +556,6 @@
       </w:r>
       <w:r>
         <w:tab/>
-        <w:t>42</w:t>
       </w:r>
     </w:p>
     <w:p>
@@ -586,7 +571,6 @@
       </w:r>
       <w:r>
         <w:tab/>
-        <w:t>44</w:t>
       </w:r>
     </w:p>
     <w:p>
@@ -602,7 +586,6 @@
       </w:r>
       <w:r>
         <w:tab/>
-        <w:t>47</w:t>
       </w:r>
     </w:p>
     <w:p>
@@ -618,7 +601,6 @@
       </w:r>
       <w:r>
         <w:tab/>
-        <w:t>49</w:t>
       </w:r>
     </w:p>
     <w:p>
@@ -634,7 +616,6 @@
       </w:r>
       <w:r>
         <w:tab/>
-        <w:t>51</w:t>
       </w:r>
     </w:p>
     <w:p>
@@ -650,7 +631,6 @@
       </w:r>
       <w:r>
         <w:tab/>
-        <w:t>52</w:t>
       </w:r>
     </w:p>
     <w:p>
@@ -669,7 +649,6 @@
       </w:r>
       <w:r>
         <w:tab/>
-        <w:t>54</w:t>
       </w:r>
     </w:p>
     <w:p>
@@ -685,7 +664,6 @@
       </w:r>
       <w:r>
         <w:tab/>
-        <w:t>54</w:t>
       </w:r>
     </w:p>
     <w:p>
@@ -701,7 +679,6 @@
       </w:r>
       <w:r>
         <w:tab/>
-        <w:t>58</w:t>
       </w:r>
     </w:p>
     <w:p>
@@ -717,7 +694,6 @@
       </w:r>
       <w:r>
         <w:tab/>
-        <w:t>60</w:t>
       </w:r>
     </w:p>
     <w:p>
@@ -733,7 +709,6 @@
       </w:r>
       <w:r>
         <w:tab/>
-        <w:t>63</w:t>
       </w:r>
     </w:p>
     <w:p>
@@ -749,7 +724,6 @@
       </w:r>
       <w:r>
         <w:tab/>
-        <w:t>66</w:t>
       </w:r>
     </w:p>
     <w:p>
@@ -765,7 +739,6 @@
       </w:r>
       <w:r>
         <w:tab/>
-        <w:t>69</w:t>
       </w:r>
     </w:p>
     <w:p>
@@ -781,7 +754,6 @@
       </w:r>
       <w:r>
         <w:tab/>
-        <w:t>73</w:t>
       </w:r>
     </w:p>
     <w:p>
@@ -797,7 +769,6 @@
       </w:r>
       <w:r>
         <w:tab/>
-        <w:t>76</w:t>
       </w:r>
     </w:p>
     <w:p>
@@ -813,7 +784,6 @@
       </w:r>
       <w:r>
         <w:tab/>
-        <w:t>78</w:t>
       </w:r>
     </w:p>
     <w:p>
@@ -829,7 +799,6 @@
       </w:r>
       <w:r>
         <w:tab/>
-        <w:t>80</w:t>
       </w:r>
     </w:p>
     <w:p>
@@ -845,7 +814,6 @@
       </w:r>
       <w:r>
         <w:tab/>
-        <w:t>82</w:t>
       </w:r>
     </w:p>
     <w:p>
@@ -861,7 +829,6 @@
       </w:r>
       <w:r>
         <w:tab/>
-        <w:t>85</w:t>
       </w:r>
     </w:p>
     <w:p>
@@ -880,7 +847,6 @@
       </w:r>
       <w:r>
         <w:tab/>
-        <w:t>87</w:t>
       </w:r>
     </w:p>
     <w:p>
@@ -896,7 +862,6 @@
       </w:r>
       <w:r>
         <w:tab/>
-        <w:t>89</w:t>
       </w:r>
     </w:p>
     <w:p>
@@ -912,7 +877,6 @@
       </w:r>
       <w:r>
         <w:tab/>
-        <w:t>89</w:t>
       </w:r>
     </w:p>
     <w:p>
@@ -931,7 +895,6 @@
       </w:r>
       <w:r>
         <w:tab/>
-        <w:t>91</w:t>
       </w:r>
     </w:p>
     <w:p>
@@ -950,7 +913,6 @@
       </w:r>
       <w:r>
         <w:tab/>
-        <w:t>99</w:t>
       </w:r>
     </w:p>
     <w:p>
@@ -966,7 +928,6 @@
       </w:r>
       <w:r>
         <w:tab/>
-        <w:t>99</w:t>
       </w:r>
     </w:p>
     <w:p>
@@ -982,7 +943,6 @@
       </w:r>
       <w:r>
         <w:tab/>
-        <w:t>101</w:t>
       </w:r>
     </w:p>
     <w:p>
@@ -3610,7 +3570,7 @@
         <w:t xml:space="preserve"> </w:t>
       </w:r>
       <w:r>
-        <w:t xml:space="preserve">Диссертация включает аннотации, список сокращений, введение, три главы, заключение, список литературы и приложения; она изложена на 101 с., содержит 23 рис. и 17 табл., число источников в списке литературы — 121. В главе 1 представлен обзор литературы, в главе 2 — методы, а в главе 3 — результаты и их обсуждение.</w:t>
+        <w:t xml:space="preserve">Диссертация включает аннотации, список сокращений, введение, три главы, заключение, список литературы и приложения; она изложена на 90 с., содержит 0 рис. и 0 табл., число источников в списке литературы — 121. В главе 1 представлен обзор литературы, в главе 2 — методы, а в главе 3 — результаты и их обсуждение.</w:t>
       </w:r>
     </w:p>
     <w:p>
@@ -5251,7 +5211,7 @@
       <w:r>
         <w:drawing>
           <wp:inline>
-            <wp:extent cx="4859999" cy="2888295"/>
+            <wp:extent cx="4499999" cy="2674348"/>
             <wp:effectExtent b="0" l="0" r="0" t="0"/>
             <wp:docPr descr="Рис. 1.1. Массовые коэффициенты ослабления (сплошные линии) и поглощения энергии (штриховые линии) серебра и мягкой ткани МКРЕ-44 в диапазоне 1–50 кэВ (данные NIST). Вертикальная штриховая линия отмечает K-край Ag при 25,51 кэВ; стрелка указывает края L-подоболочек Ag." title="" id="21" name="Picture"/>
             <a:graphic>
@@ -5272,7 +5232,7 @@
                   <pic:spPr bwMode="auto">
                     <a:xfrm>
                       <a:off x="0" y="0"/>
-                      <a:ext cx="4859999" cy="2888295"/>
+                      <a:ext cx="4499999" cy="2674348"/>
                     </a:xfrm>
                     <a:prstGeom prst="rect">
                       <a:avLst/>
@@ -5553,7 +5513,7 @@
       <w:r>
         <w:drawing>
           <wp:inline>
-            <wp:extent cx="4859999" cy="2865245"/>
+            <wp:extent cx="4499999" cy="2653005"/>
             <wp:effectExtent b="0" l="0" r="0" t="0"/>
             <wp:docPr descr="Рис. 1.2. Отношение массовых коэффициентов поглощения энергии Ag, I, Gd, Pt, Au и Bi к соответствующему коэффициенту мягкой ткани МКРЕ-44 в диапазоне 5–45 кэВ (данные NIST). Вертикальная штриховая линия отмечает K-край Ag при 25,51 кэВ." title="" id="24" name="Picture"/>
             <a:graphic>
@@ -5574,7 +5534,7 @@
                   <pic:spPr bwMode="auto">
                     <a:xfrm>
                       <a:off x="0" y="0"/>
-                      <a:ext cx="4859999" cy="2865245"/>
+                      <a:ext cx="4499999" cy="2653005"/>
                     </a:xfrm>
                     <a:prstGeom prst="rect">
                       <a:avLst/>
@@ -7034,7 +6994,7 @@
       <w:r>
         <w:drawing>
           <wp:inline>
-            <wp:extent cx="4859999" cy="2557894"/>
+            <wp:extent cx="4499999" cy="2368421"/>
             <wp:effectExtent b="0" l="0" r="0" t="0"/>
             <wp:docPr descr="Рис. 2.1. Принципиальная схема моделируемой трубки с отражательной мишенью и медным анодом и геометрии облучения: фотоны, испускаемые вдоль центрального луча под углом анода θ, проходят через бериллиевое окно, дополнительный фильтр и воздушный промежуток (расстояние фокус–образец d, в тексте обозначаемое r) к образцу ткани, содержащей Ag." title="" id="27" name="Picture"/>
             <a:graphic>
@@ -7055,7 +7015,7 @@
                   <pic:spPr bwMode="auto">
                     <a:xfrm>
                       <a:off x="0" y="0"/>
-                      <a:ext cx="4859999" cy="2557894"/>
+                      <a:ext cx="4499999" cy="2368421"/>
                     </a:xfrm>
                     <a:prstGeom prst="rect">
                       <a:avLst/>
@@ -9264,7 +9224,7 @@
       <w:r>
         <w:drawing>
           <wp:inline>
-            <wp:extent cx="4859999" cy="2355476"/>
+            <wp:extent cx="4499999" cy="2180996"/>
             <wp:effectExtent b="0" l="0" r="0" t="0"/>
             <wp:docPr descr="Рис. 2.2. Замедление электронов и ионизация K-оболочки в медном аноде: (a) ионизационная тормозная способность по Бете (сплошная линия, левая ось) и глубина проникновения, на которой электрон с начальной энергией 45 кэВ замедлился до энергии T, при η = 0,40 и θ = 12° (штриховая линия, правая ось); (b) сечение ионизации K-оболочки меди по Гризинскому." title="" id="30" name="Picture"/>
             <a:graphic>
@@ -9285,7 +9245,7 @@
                   <pic:spPr bwMode="auto">
                     <a:xfrm>
                       <a:off x="0" y="0"/>
-                      <a:ext cx="4859999" cy="2355476"/>
+                      <a:ext cx="4499999" cy="2180996"/>
                     </a:xfrm>
                     <a:prstGeom prst="rect">
                       <a:avLst/>
@@ -28241,7 +28201,7 @@
       <w:r>
         <w:drawing>
           <wp:inline>
-            <wp:extent cx="4859999" cy="3335715"/>
+            <wp:extent cx="4499999" cy="3088625"/>
             <wp:effectExtent b="0" l="0" r="0" t="0"/>
             <wp:docPr descr="Рис. 3.1. Спектры трубки с медным анодом при 45 кВ (базовая геометрия), рассчитанные по SpekPy v2 и по разработанной модели, без дополнительной фильтрации (слева) и с фильтром 1,0 мм Al (справа), нормированные на одинаковую площадь тормозного излучения выше 9,6 кэВ; на нижних панелях — их отношение." title="" id="33" name="Picture"/>
             <a:graphic>
@@ -28262,7 +28222,7 @@
                   <pic:spPr bwMode="auto">
                     <a:xfrm>
                       <a:off x="0" y="0"/>
-                      <a:ext cx="4859999" cy="3335715"/>
+                      <a:ext cx="4499999" cy="3088625"/>
                     </a:xfrm>
                     <a:prstGeom prst="rect">
                       <a:avLst/>
@@ -28792,7 +28752,7 @@
       <w:r>
         <w:drawing>
           <wp:inline>
-            <wp:extent cx="4859999" cy="2865245"/>
+            <wp:extent cx="4499999" cy="2653005"/>
             <wp:effectExtent b="0" l="0" r="0" t="0"/>
             <wp:docPr descr="Рис. 3.2. Спектры трубки с вольфрамовым анодом (θ = 12°, 2,5 мм Al) при 50, 80 и 100 кВ, рассчитанные по SpekPy v2 (сплошные линии) и по разработанной модели (штриховые линии, η = 0,40), нормированные на одинаковую площадь." title="" id="36" name="Picture"/>
             <a:graphic>
@@ -28813,7 +28773,7 @@
                   <pic:spPr bwMode="auto">
                     <a:xfrm>
                       <a:off x="0" y="0"/>
-                      <a:ext cx="4859999" cy="2865245"/>
+                      <a:ext cx="4499999" cy="2653005"/>
                     </a:xfrm>
                     <a:prstGeom prst="rect">
                       <a:avLst/>
@@ -28863,7 +28823,7 @@
       <w:r>
         <w:drawing>
           <wp:inline>
-            <wp:extent cx="4859999" cy="2865245"/>
+            <wp:extent cx="4499999" cy="2653005"/>
             <wp:effectExtent b="0" l="0" r="0" t="0"/>
             <wp:docPr descr="Рис. 3.3. Спектр трубки с медным анодом при 45 кВ (θ = 12°, 0,5 мм Be, 10 см воздуха), рассчитанный по SpekPy v2 и по разработанной модели. Штриховая линия отмечает K-край Ag (25,514 кэВ)." title="" id="39" name="Picture"/>
             <a:graphic>
@@ -28884,7 +28844,7 @@
                   <pic:spPr bwMode="auto">
                     <a:xfrm>
                       <a:off x="0" y="0"/>
-                      <a:ext cx="4859999" cy="2865245"/>
+                      <a:ext cx="4499999" cy="2653005"/>
                     </a:xfrm>
                     <a:prstGeom prst="rect">
                       <a:avLst/>
@@ -29869,7 +29829,7 @@
       <w:r>
         <w:drawing>
           <wp:inline>
-            <wp:extent cx="4859999" cy="2865245"/>
+            <wp:extent cx="4499999" cy="2653005"/>
             <wp:effectExtent b="0" l="0" r="0" t="0"/>
             <wp:docPr descr="Рис. 3.4. Влияние угла анода (6–30°) на спектр трубки с медным анодом при 45 кВ (0,5 мм Be, 10 см воздуха; SpekPy v2). Штриховая линия отмечает K-край Ag." title="" id="42" name="Picture"/>
             <a:graphic>
@@ -29890,7 +29850,7 @@
                   <pic:spPr bwMode="auto">
                     <a:xfrm>
                       <a:off x="0" y="0"/>
-                      <a:ext cx="4859999" cy="2865245"/>
+                      <a:ext cx="4499999" cy="2653005"/>
                     </a:xfrm>
                     <a:prstGeom prst="rect">
                       <a:avLst/>
@@ -29955,7 +29915,7 @@
       <w:r>
         <w:drawing>
           <wp:inline>
-            <wp:extent cx="4859999" cy="2865245"/>
+            <wp:extent cx="4499999" cy="2653005"/>
             <wp:effectExtent b="0" l="0" r="0" t="0"/>
             <wp:docPr descr="Рис. 3.5. Спектры трубки с медным анодом при напряжениях на трубке 25–50 кВ (базовая геометрия; SpekPy v2). Штриховая линия отмечает K-край Ag." title="" id="45" name="Picture"/>
             <a:graphic>
@@ -29976,7 +29936,7 @@
                   <pic:spPr bwMode="auto">
                     <a:xfrm>
                       <a:off x="0" y="0"/>
-                      <a:ext cx="4859999" cy="2865245"/>
+                      <a:ext cx="4499999" cy="2653005"/>
                     </a:xfrm>
                     <a:prstGeom prst="rect">
                       <a:avLst/>
@@ -30018,7 +29978,7 @@
       <w:r>
         <w:drawing>
           <wp:inline>
-            <wp:extent cx="4859999" cy="2830869"/>
+            <wp:extent cx="4499999" cy="2621175"/>
             <wp:effectExtent b="0" l="0" r="0" t="0"/>
             <wp:docPr descr="Рис. 3.6. Влияние толщины бериллиевого окна (0,15–2,0 мм) на низкоэнергетическую часть спектра трубки с медным анодом при 45 кВ (θ = 12°, 10 см воздуха; SpekPy v2)." title="" id="48" name="Picture"/>
             <a:graphic>
@@ -30039,7 +29999,7 @@
                   <pic:spPr bwMode="auto">
                     <a:xfrm>
                       <a:off x="0" y="0"/>
-                      <a:ext cx="4859999" cy="2830869"/>
+                      <a:ext cx="4499999" cy="2621175"/>
                     </a:xfrm>
                     <a:prstGeom prst="rect">
                       <a:avLst/>
@@ -31727,7 +31687,7 @@
       <w:r>
         <w:drawing>
           <wp:inline>
-            <wp:extent cx="4859999" cy="2868196"/>
+            <wp:extent cx="4499999" cy="2655737"/>
             <wp:effectExtent b="0" l="0" r="0" t="0"/>
             <wp:docPr descr="Рис. 3.7. Спектры трубки с медным анодом при 45 кВ с дополнительными фильтрами Al толщиной 0,25–2,0 мм (базовая геометрия; SpekPy v2). Штриховая линия отмечает K-край Ag." title="" id="51" name="Picture"/>
             <a:graphic>
@@ -31748,7 +31708,7 @@
                   <pic:spPr bwMode="auto">
                     <a:xfrm>
                       <a:off x="0" y="0"/>
-                      <a:ext cx="4859999" cy="2868196"/>
+                      <a:ext cx="4499999" cy="2655737"/>
                     </a:xfrm>
                     <a:prstGeom prst="rect">
                       <a:avLst/>
@@ -31869,7 +31829,7 @@
       <w:r>
         <w:drawing>
           <wp:inline>
-            <wp:extent cx="4859999" cy="2868196"/>
+            <wp:extent cx="4499999" cy="2655737"/>
             <wp:effectExtent b="0" l="0" r="0" t="0"/>
             <wp:docPr descr="Рис. 3.8. Спектры трубки с медным анодом при 45 кВ с фильтром Ni толщиной 0,02 мм и с фильтрами Cu толщиной 0,05–0,2 мм (базовая геометрия; SpekPy v2). Штриховая линия отмечает K-край Ag." title="" id="54" name="Picture"/>
             <a:graphic>
@@ -31890,7 +31850,7 @@
                   <pic:spPr bwMode="auto">
                     <a:xfrm>
                       <a:off x="0" y="0"/>
-                      <a:ext cx="4859999" cy="2868196"/>
+                      <a:ext cx="4499999" cy="2655737"/>
                     </a:xfrm>
                     <a:prstGeom prst="rect">
                       <a:avLst/>
@@ -31955,7 +31915,7 @@
       <w:r>
         <w:drawing>
           <wp:inline>
-            <wp:extent cx="4859999" cy="2957476"/>
+            <wp:extent cx="4499999" cy="2738404"/>
             <wp:effectExtent b="0" l="0" r="0" t="0"/>
             <wp:docPr descr="Рис. 3.9. Спектры трубки с медным анодом при 45 кВ с фильтрами Mo 0,05 мм, Ag 0,05 мм и Sn 0,05 и 0,1 мм в сравнении со спектром с фильтром 1,0 мм Al, отнесённые к максимуму спектра с фильтром Al (SpekPy v2). Штриховая линия отмечает K-край Ag." title="" id="57" name="Picture"/>
             <a:graphic>
@@ -31976,7 +31936,7 @@
                   <pic:spPr bwMode="auto">
                     <a:xfrm>
                       <a:off x="0" y="0"/>
-                      <a:ext cx="4859999" cy="2957476"/>
+                      <a:ext cx="4499999" cy="2738404"/>
                     </a:xfrm>
                     <a:prstGeom prst="rect">
                       <a:avLst/>
@@ -34053,7 +34013,7 @@
       <w:r>
         <w:drawing>
           <wp:inline>
-            <wp:extent cx="4859999" cy="2047586"/>
+            <wp:extent cx="4499999" cy="1895913"/>
             <wp:effectExtent b="0" l="0" r="0" t="0"/>
             <wp:docPr descr="Рис. 3.10. Подынтегральная функция дозы E\,\Phi(E)\,\mu_{en}/\rho для мягкой ткани МКРЕ-44 (закрашенная область) и ткани с 1 % Ag (линия) без фильтрации (слева) и с фильтром 1,0 мм Al (справа); трубка с медным анодом при 45 кВ, SpekPy v2. Штриховая линия отмечает K-край Ag." title="" id="60" name="Picture"/>
             <a:graphic>
@@ -34074,7 +34034,7 @@
                   <pic:spPr bwMode="auto">
                     <a:xfrm>
                       <a:off x="0" y="0"/>
-                      <a:ext cx="4859999" cy="2047586"/>
+                      <a:ext cx="4499999" cy="1895913"/>
                     </a:xfrm>
                     <a:prstGeom prst="rect">
                       <a:avLst/>
@@ -34332,7 +34292,7 @@
       <w:r>
         <w:drawing>
           <wp:inline>
-            <wp:extent cx="4859999" cy="2918404"/>
+            <wp:extent cx="4499999" cy="2702226"/>
             <wp:effectExtent b="0" l="0" r="0" t="0"/>
             <wp:docPr descr="Рис. 3.11. Зависимость коэффициента усиления дозы для мягкой ткани МКРЕ-44 от массовой доли Ag при различных дополнительных фильтрах (спектры SpekPy v2, приближение кермы на поверхности)." title="" id="63" name="Picture"/>
             <a:graphic>
@@ -34353,7 +34313,7 @@
                   <pic:spPr bwMode="auto">
                     <a:xfrm>
                       <a:off x="0" y="0"/>
-                      <a:ext cx="4859999" cy="2918404"/>
+                      <a:ext cx="4499999" cy="2702226"/>
                     </a:xfrm>
                     <a:prstGeom prst="rect">
                       <a:avLst/>
@@ -36333,7 +36293,7 @@
       <w:r>
         <w:drawing>
           <wp:inline>
-            <wp:extent cx="4859999" cy="2875426"/>
+            <wp:extent cx="4499999" cy="2662431"/>
             <wp:effectExtent b="0" l="0" r="0" t="0"/>
             <wp:docPr descr="Рис. 3.12. Зависимость коэффициента усиления дозы для 1 % Ag от относительной воздушной кермы для фильтров из Al, Ti, Ni, Cu, Mo, Ag и Sn возрастающей толщины (трубка с медным анодом при 45 кВ, базовая геометрия; SpekPy v2)." title="" id="66" name="Picture"/>
             <a:graphic>
@@ -36354,7 +36314,7 @@
                   <pic:spPr bwMode="auto">
                     <a:xfrm>
                       <a:off x="0" y="0"/>
-                      <a:ext cx="4859999" cy="2875426"/>
+                      <a:ext cx="4499999" cy="2662431"/>
                     </a:xfrm>
                     <a:prstGeom prst="rect">
                       <a:avLst/>
@@ -37037,7 +36997,7 @@
       <w:r>
         <w:drawing>
           <wp:inline>
-            <wp:extent cx="4859999" cy="2936437"/>
+            <wp:extent cx="4499999" cy="2718923"/>
             <wp:effectExtent b="0" l="0" r="0" t="0"/>
             <wp:docPr descr="Рис. 3.13. Коэффициент усиления дозы для 1 % Ag с фильтрами из элементов с Z = 13–83, толщина которых обеспечивает одинаковое пропускание по воздушной керме 10 %, 1 % и 0,1 % (трубка с медным анодом при 45 кВ, базовая геометрия; SpekPy v2)." title="" id="69" name="Picture"/>
             <a:graphic>
@@ -37058,7 +37018,7 @@
                   <pic:spPr bwMode="auto">
                     <a:xfrm>
                       <a:off x="0" y="0"/>
-                      <a:ext cx="4859999" cy="2936437"/>
+                      <a:ext cx="4499999" cy="2718923"/>
                     </a:xfrm>
                     <a:prstGeom prst="rect">
                       <a:avLst/>
@@ -40067,7 +40027,7 @@
       <w:r>
         <w:drawing>
           <wp:inline>
-            <wp:extent cx="4859999" cy="2921410"/>
+            <wp:extent cx="4499999" cy="2705009"/>
             <wp:effectExtent b="0" l="0" r="0" t="0"/>
             <wp:docPr descr="Рис. 3.14. Зависимость коэффициента усиления дозы для 1 % Ag от глубины расположения области, содержащей серебро, в мягкой ткани без серебра для нефильтрованного пучка при 45 кВ и с четырьмя дополнительными фильтрами (SpekPy, первичный пучок, приближение кермы)." title="" id="72" name="Picture"/>
             <a:graphic>
@@ -40088,7 +40048,7 @@
                   <pic:spPr bwMode="auto">
                     <a:xfrm>
                       <a:off x="0" y="0"/>
-                      <a:ext cx="4859999" cy="2921410"/>
+                      <a:ext cx="4499999" cy="2705009"/>
                     </a:xfrm>
                     <a:prstGeom prst="rect">
                       <a:avLst/>
@@ -41515,7 +41475,7 @@
       <w:r>
         <w:drawing>
           <wp:inline>
-            <wp:extent cx="4859999" cy="2942448"/>
+            <wp:extent cx="4499999" cy="2724489"/>
             <wp:effectExtent b="0" l="0" r="0" t="0"/>
             <wp:docPr descr="Рис. 3.15. Зависимость коэффициента усиления дозы от глубины внутри области, равномерно содержащей серебро и начинающейся от поверхности: 0,5; 1,0 и 2,0 % Ag, фильтры Al 1,0 мм (сплошные линии) и Sn 0,1 мм (штриховые линии), самоэкранирование учтено." title="" id="75" name="Picture"/>
             <a:graphic>
@@ -41536,7 +41496,7 @@
                   <pic:spPr bwMode="auto">
                     <a:xfrm>
                       <a:off x="0" y="0"/>
-                      <a:ext cx="4859999" cy="2942448"/>
+                      <a:ext cx="4499999" cy="2724489"/>
                     </a:xfrm>
                     <a:prstGeom prst="rect">
                       <a:avLst/>
@@ -41635,7 +41595,7 @@
       <w:r>
         <w:drawing>
           <wp:inline>
-            <wp:extent cx="4859999" cy="2960482"/>
+            <wp:extent cx="4499999" cy="2741187"/>
             <wp:effectExtent b="0" l="0" r="0" t="0"/>
             <wp:docPr descr="Рис. 3.16. Зависимость коэффициента усиления дозы для 1 % Ag от напряжения на трубке (фильтры Al 0,5 и 1,0 мм): SpekPy v2 для 20–50 кВ (сплошные линии) и разработанная модель для 60–80 кВ (штриховые линии); вертикальная линия отмечает K-край Ag." title="" id="78" name="Picture"/>
             <a:graphic>
@@ -41656,7 +41616,7 @@
                   <pic:spPr bwMode="auto">
                     <a:xfrm>
                       <a:off x="0" y="0"/>
-                      <a:ext cx="4859999" cy="2960482"/>
+                      <a:ext cx="4499999" cy="2741187"/>
                     </a:xfrm>
                     <a:prstGeom prst="rect">
                       <a:avLst/>
@@ -42584,7 +42544,7 @@
       <w:r>
         <w:drawing>
           <wp:inline>
-            <wp:extent cx="4859999" cy="2789165"/>
+            <wp:extent cx="4499999" cy="2582560"/>
             <wp:effectExtent b="0" l="0" r="0" t="0"/>
             <wp:docPr descr="Рис. 3.17. Коэффициент усиления дозы для мягкой ткани, содержащей 1 % по массе Ag, I, Gd, Pt, Au или Bi, при 45 кВ без дополнительного фильтра и с фильтром Al 1,0 мм или Sn 0,1 мм (SpekPy, приближение кермы)." title="" id="81" name="Picture"/>
             <a:graphic>
@@ -42605,7 +42565,7 @@
                   <pic:spPr bwMode="auto">
                     <a:xfrm>
                       <a:off x="0" y="0"/>
-                      <a:ext cx="4859999" cy="2789165"/>
+                      <a:ext cx="4499999" cy="2582560"/>
                     </a:xfrm>
                     <a:prstGeom prst="rect">
                       <a:avLst/>
@@ -43306,7 +43266,7 @@
       <w:r>
         <w:drawing>
           <wp:inline>
-            <wp:extent cx="4859999" cy="2125747"/>
+            <wp:extent cx="4499999" cy="1968284"/>
             <wp:effectExtent b="0" l="0" r="0" t="0"/>
             <wp:docPr descr="Рис. 3.18. Глубинные профили коэффициента усиления дозы в мягкой ткани со слоем толщиной 10 мм, содержащим 1 % Ag, на глубинах 2–12 мм (серая полоса) без фильтра (слева) и с фильтром Al 1,0 мм (справа): метод Монте-Карло (сплошная линия, закрашенная полоса — ±2 стандартные ошибки) и аналитическая модель кермы (штриховая линия)." title="" id="84" name="Picture"/>
             <a:graphic>
@@ -43327,7 +43287,7 @@
                   <pic:spPr bwMode="auto">
                     <a:xfrm>
                       <a:off x="0" y="0"/>
-                      <a:ext cx="4859999" cy="2125747"/>
+                      <a:ext cx="4499999" cy="1968284"/>
                     </a:xfrm>
                     <a:prstGeom prst="rect">
                       <a:avLst/>
@@ -44250,7 +44210,7 @@
       <w:r>
         <w:drawing>
           <wp:inline>
-            <wp:extent cx="4859999" cy="2900322"/>
+            <wp:extent cx="4499999" cy="2685483"/>
             <wp:effectExtent b="0" l="0" r="0" t="0"/>
             <wp:docPr descr="Рис. 3.19. Чувствительность коэффициента усиления дозы (1 % Ag, Al 1,0 мм, DEF = 1,482) к входным параметрам на двух границах интервала варьирования каждого параметра. Модель спектра: РМ относительно SpekPy; эталонная среда: четырёхкомпонентная ткань МКРЕ (большее изменение) и вода; η: относительно значения РМ." title="" id="87" name="Picture"/>
             <a:graphic>
@@ -44271,7 +44231,7 @@
                   <pic:spPr bwMode="auto">
                     <a:xfrm>
                       <a:off x="0" y="0"/>
-                      <a:ext cx="4859999" cy="2900322"/>
+                      <a:ext cx="4499999" cy="2685483"/>
                     </a:xfrm>
                     <a:prstGeom prst="rect">
                       <a:avLst/>

</xml_diff>